<commit_message>
docs(cd,thesis,p6): reframe both chuyên đề + build dissertation/P6/CĐ deliverables
Adjust the two doctoral chuyên đề per peer review (controlled boldness, no data changes):
CĐ1 abstract now names the Forced Internationalization Penalty at SIDS and reads the seven
sub-landscapes as regions on a strategic export topography (ICRV as transaction cost filter);
CĐ2 abstract reframes the four-theory integration as one ICRV-centric architecture rather
than parallel traditions. Build ad-hoc DOCX (pandoc + CTU templates): CĐ1/CĐ2, P6 (EN+VN),
the reframed dissertation chapters, and a full assembled LUAN_AN_FULL_vi.docx — all verified
to carry the topography/flagship reframing. P7/P8 DOCX intentionally NOT rebuilt pending the
data re-run from the edit branch.

https://claude.ai/code/session_01TNqoRFY1vAVQL6GWg8X9M3
</commit_message>
<xml_diff>
--- a/dist/downloads/CD2_chuyen_de_2.docx
+++ b/dist/downloads/CD2_chuyen_de_2.docx
@@ -2,7 +2,7 @@
 <file path=word/document.xml><?xml version="1.0" encoding="utf-8"?>
 <w:document xmlns:w="http://schemas.openxmlformats.org/wordprocessingml/2006/main" xmlns:m="http://schemas.openxmlformats.org/officeDocument/2006/math" xmlns:r="http://schemas.openxmlformats.org/officeDocument/2006/relationships" xmlns:o="urn:schemas-microsoft-com:office:office" xmlns:v="urn:schemas-microsoft-com:vml" xmlns:w10="urn:schemas-microsoft-com:office:word" xmlns:a="http://schemas.openxmlformats.org/drawingml/2006/main" xmlns:pic="http://schemas.openxmlformats.org/drawingml/2006/picture" xmlns:wp="http://schemas.openxmlformats.org/drawingml/2006/wordprocessingDrawing">
   <w:body>
-    <w:bookmarkStart w:id="97" w:name="chuyên-đề-tiến-sĩ-số-2"/>
+    <w:bookmarkStart w:id="91" w:name="chuyên-đề-tiến-sĩ-số-2"/>
     <w:p>
       <w:pPr>
         <w:pStyle w:val="Heading1"/>
@@ -210,7 +210,7 @@
         <w:pStyle w:val="FirstParagraph"/>
       </w:pPr>
       <w:r>
-        <w:t xml:space="preserve">Chuyên đề này xây dựng mô hình nghiên cứu lý thuyết và thực nghiệm về ảnh hưởng của quốc tế hóa đến hiệu quả hoạt động kinh doanh của các doanh nghiệp ở các quốc gia châu Á trong giai đoạn 2009-2025. Khung lý thuyết tích hợp bốn tầng, Uppsala Model (Johanson &amp; Vahlne, 1977, 2009), Resource-Based View (Barney, 1991; Wernerfelt, 1984), Institutional Theory (North, 1990; Khanna &amp; Palepu, 2010; Peng, 2003) và Upper Echelons Theory (Hambrick &amp; Mason, 1984; Hambrick, 2007), kết hợp với Foundational Digital Adoption Framework (Banalieva &amp; Dhanaraj, 2019; Verhoef et al., 2021; Stallkamp &amp; Schotter, 2021) làm nền tảng lý thuyết. Lược khảo năm dạng hàm quan hệ quốc tế hóa, hiệu quả (I-P) gồm tuyến tính, chữ U ngược, S-curve, M-curve, và forced penalty, cùng năm meta-analysis lớn giai đoạn 1980-2024, cho thấy khoảng trống thực nghiệm trong việc kiểm định đồng thời phi tuyến và điều tiết đa tầng ở châu Á. Hệ giả thuyết H1-H6 được phát triển: H1 phi tuyến dạng chữ U ngược hoặc S-curve; H2 Technological Capability Index (TCI) điều tiết tích cực; H3a-H3b Digital Adoption Index (DAI) điều tiết phụ thuộc chế độ thể chế: có điều kiện ở Emerging/Frontier (H3a, dương trong OLS nhưng phụ thuộc bối cảnh và có thể null trong kiểm định nhân quả) và có điều kiện/null ở Advanced (H3b), phân biệt với TCI; H4a-H4c đặc điểm nhà quản trị điều tiết (kinh nghiệm, học vấn, giới tính, tách biệt dấu kỳ vọng); H5 thể chế nội địa điều tiết theo gradient ICRV sáu nhóm; H6 tính không đồng nhất theo thời gian. Tám mô hình thực nghiệm M0-M7 được đặc tả, từ baseline tuyến tính đến mô hình điều tiết ba chiều cấp luận án. Chiến lược nhận dạng đa tầng và kế hoạch kiểm định độ vững toàn diện được thiết kế cho pool 101.185 doanh nghiệp ở 47 nền kinh tế châu Á và Thái Bình Dương, bao gồm 108 cặp quốc gia-năm qua 14 mốc khảo sát WBES giai đoạn 2009-2025. Bốn đóng góp chính: (i) khung tích hợp 4 tầng kết hợp Foundational Digital Adoption Framework chưa có tương đương cho châu Á; (ii) tách bạch TCI và DAI theo Mô hình Áp dụng số và Năng lực phụ thuộc bối cảnh (CDCM); (iii) mô hình M7 điều tiết ba chiều; (iv) phân loại nhánh Advanced thành tiên tiến đổi mới sáng tạo dẫn dắt (ICRV Nhóm I) và tiên tiến tài nguyên dẫn dắt (ICRV Nhóm II). Ba bản thảo thực nghiệm đồng hành, P3 Việt Nam (JABS, under review), P4 Singapore (MIR, under review), P5 Trung Quốc (IJOEM, under review), cung cấp bằng chứng quốc gia cụ thể kiểm định H1-H6 và xác nhận tính khả nghiệm của mô hình đề xuất.</w:t>
+        <w:t xml:space="preserve">Chuyên đề này xây dựng mô hình nghiên cứu lý thuyết và thực nghiệm về ảnh hưởng của quốc tế hóa đến hiệu quả hoạt động kinh doanh của các doanh nghiệp ở các quốc gia châu Á trong giai đoạn 2009-2025. Khung lý thuyết tích hợp bốn tầng, Uppsala Model (Johanson &amp; Vahlne, 1977, 2009), Resource-Based View (Barney, 1991; Wernerfelt, 1984), Institutional Theory (North, 1990; Khanna &amp; Palepu, 2010; Peng, 2003) và Upper Echelons Theory (Hambrick &amp; Mason, 1984; Hambrick, 2007), kết hợp với Foundational Digital Adoption Framework (Banalieva &amp; Dhanaraj, 2019; Verhoef et al., 2021; Stallkamp &amp; Schotter, 2021) làm nền tảng lý thuyết. Bốn truyền thống này không vận hành song song mà hội tụ quanh một trục tổ chức duy nhất: chế độ thể chế ICRV hoạt động như một bộ lọc chi phí giao dịch (transaction cost filter) xác định một bản đồ địa hình xuất khẩu chiến lược (strategic export topography), trong đó RBV (TCI, DAI) là các tấm lá chắn cấp doanh nghiệp, Uppsala mô tả sự di chuyển dọc theo địa hình, còn Upper Echelons đi vào như biến kiểm soát nội sinh về chất lượng quản trị. Lược khảo năm dạng hàm quan hệ quốc tế hóa, hiệu quả (I-P) gồm tuyến tính, chữ U ngược, S-curve, M-curve, và forced penalty, cùng năm meta-analysis lớn giai đoạn 1980-2024, cho thấy khoảng trống thực nghiệm trong việc kiểm định đồng thời phi tuyến và điều tiết đa tầng ở châu Á. Hệ giả thuyết H1-H6 được phát triển: H1 phi tuyến dạng chữ U ngược hoặc S-curve; H2 Technological Capability Index (TCI) điều tiết tích cực; H3a-H3b Digital Adoption Index (DAI) điều tiết phụ thuộc chế độ thể chế: có điều kiện ở Emerging/Frontier (H3a, dương trong OLS nhưng phụ thuộc bối cảnh và có thể null trong kiểm định nhân quả) và có điều kiện/null ở Advanced (H3b), phân biệt với TCI; H4a-H4c đặc điểm nhà quản trị điều tiết (kinh nghiệm, học vấn, giới tính, tách biệt dấu kỳ vọng); H5 thể chế nội địa điều tiết theo gradient ICRV sáu nhóm; H6 tính không đồng nhất theo thời gian. Tám mô hình thực nghiệm M0-M7 được đặc tả, từ baseline tuyến tính đến mô hình điều tiết ba chiều cấp luận án. Chiến lược nhận dạng đa tầng và kế hoạch kiểm định độ vững toàn diện được thiết kế cho pool 101.185 doanh nghiệp ở 47 nền kinh tế châu Á và Thái Bình Dương, bao gồm 108 cặp quốc gia-năm qua 14 mốc khảo sát WBES giai đoạn 2009-2025. Bốn đóng góp chính: (i) khung tích hợp 4 tầng kết hợp Foundational Digital Adoption Framework chưa có tương đương cho châu Á; (ii) tách bạch TCI và DAI theo Mô hình Áp dụng số và Năng lực phụ thuộc bối cảnh (CDCM); (iii) mô hình M7 điều tiết ba chiều; (iv) phân loại nhánh Advanced thành tiên tiến đổi mới sáng tạo dẫn dắt (ICRV Nhóm I) và tiên tiến tài nguyên dẫn dắt (ICRV Nhóm II). Ba bản thảo thực nghiệm đồng hành, P3 Việt Nam (JABS, under review), P4 Singapore (MIR, under review), P5 Trung Quốc (IJOEM, under review), cung cấp bằng chứng quốc gia cụ thể kiểm định H1-H6 và xác nhận tính khả nghiệm của mô hình đề xuất.</w:t>
       </w:r>
     </w:p>
     <w:p>
@@ -1579,7 +1579,7 @@
       </w:r>
     </w:p>
     <w:bookmarkEnd w:id="26"/>
-    <w:bookmarkStart w:id="90" w:name="phần-2-nội-dung-chuyên-đề"/>
+    <w:bookmarkStart w:id="84" w:name="phần-2-nội-dung-chuyên-đề"/>
     <w:p>
       <w:pPr>
         <w:pStyle w:val="Heading2"/>
@@ -1930,7 +1930,7 @@
       </w:r>
     </w:p>
     <w:bookmarkEnd w:id="33"/>
-    <w:bookmarkStart w:id="85" w:name="kết-quả-và-thảo-luận"/>
+    <w:bookmarkStart w:id="79" w:name="kết-quả-và-thảo-luận"/>
     <w:p>
       <w:pPr>
         <w:pStyle w:val="Heading3"/>
@@ -5271,7 +5271,7 @@
     </w:p>
     <w:bookmarkEnd w:id="43"/>
     <w:bookmarkEnd w:id="44"/>
-    <w:bookmarkStart w:id="54" w:name="X544ac3c1efd6eca36fd2a6dd76d3c4cb20b85eb"/>
+    <w:bookmarkStart w:id="48" w:name="X544ac3c1efd6eca36fd2a6dd76d3c4cb20b85eb"/>
     <w:p>
       <w:pPr>
         <w:pStyle w:val="Heading4"/>
@@ -5376,7 +5376,7 @@
         <w:t xml:space="preserve">(quy mô, tuổi, sở hữu nước ngoài, sector FE, country FE, year FE).</w:t>
       </w:r>
     </w:p>
-    <w:bookmarkStart w:id="48" w:name="X554d9a38aa5071c54dd41cf832555f814bf88a4"/>
+    <w:bookmarkStart w:id="45" w:name="X554d9a38aa5071c54dd41cf832555f814bf88a4"/>
     <w:p>
       <w:pPr>
         <w:pStyle w:val="Heading5"/>
@@ -5385,53 +5385,31 @@
         <w:t xml:space="preserve">Hình 2.1, Khung khái niệm tích hợp (tổng quan)</w:t>
       </w:r>
     </w:p>
-    <w:p>
-      <w:pPr>
-        <w:pStyle w:val="CaptionedFigure"/>
-      </w:pPr>
-      <w:r>
-        <w:drawing>
-          <wp:inline>
-            <wp:extent cx="5753100" cy="4009802"/>
-            <wp:effectExtent b="0" l="0" r="0" t="0"/>
-            <wp:docPr descr="Hình 2.1: Khung khái niệm tích hợp CĐ2" title="" id="46" name="Picture"/>
-            <a:graphic>
-              <a:graphicData uri="http://schemas.openxmlformats.org/drawingml/2006/picture">
-                <pic:pic>
-                  <pic:nvPicPr>
-                    <pic:cNvPr descr="figures/hinh_2_1_khung_khai_niem.png" id="47" name="Picture"/>
-                    <pic:cNvPicPr>
-                      <a:picLocks noChangeArrowheads="1" noChangeAspect="1"/>
-                    </pic:cNvPicPr>
-                  </pic:nvPicPr>
-                  <pic:blipFill>
-                    <a:blip r:embed="rId45"/>
-                    <a:stretch>
-                      <a:fillRect/>
-                    </a:stretch>
-                  </pic:blipFill>
-                  <pic:spPr bwMode="auto">
-                    <a:xfrm>
-                      <a:off x="0" y="0"/>
-                      <a:ext cx="5753100" cy="4009802"/>
-                    </a:xfrm>
-                    <a:prstGeom prst="rect">
-                      <a:avLst/>
-                    </a:prstGeom>
-                    <a:noFill/>
-                    <a:ln w="9525">
-                      <a:noFill/>
-                      <a:headEnd/>
-                      <a:tailEnd/>
-                    </a:ln>
-                  </pic:spPr>
-                </pic:pic>
-              </a:graphicData>
-            </a:graphic>
-          </wp:inline>
-        </w:drawing>
-      </w:r>
-    </w:p>
+    <w:tbl>
+      <w:tblPr>
+        <w:tblStyle w:val="FigureTable"/>
+        <w:tblW w:type="auto" w:w="0"/>
+        <w:tblLook w:firstRow="0" w:lastRow="0" w:firstColumn="0" w:lastColumn="0"/>
+        <w:jc w:val="center"/>
+      </w:tblPr>
+      <w:tblGrid>
+        <w:gridCol w:w="7920"/>
+      </w:tblGrid>
+      <w:tr>
+        <w:tc>
+          <w:tcPr/>
+          <w:p>
+            <w:pPr>
+              <w:pStyle w:val="Compact"/>
+              <w:jc w:val="center"/>
+            </w:pPr>
+            <w:r>
+              <w:t xml:space="preserve">Hình 2.1: Khung khái niệm tích hợp CĐ2</w:t>
+            </w:r>
+          </w:p>
+        </w:tc>
+      </w:tr>
+    </w:tbl>
     <w:p>
       <w:pPr>
         <w:pStyle w:val="ImageCaption"/>
@@ -5514,8 +5492,8 @@
         <w:t xml:space="preserve">_c) ở cực trái. Năm nhóm biến điều tiết phân theo hai cấp: cấp doanh nghiệp (TCI, H2, DAI, H3, đặc điểm nhà quản trị, H4a-H4c) và cấp quốc gia (ICRV regime, H5, giai đoạn thời gian, H6). Biến kiểm soát (ln(emp), firm_age, foreign_own, sector/country/year FE) được đưa vào mô hình thực nghiệm nhưng không hiển thị trong sơ đồ để đơn giản hóa trình bày. Mỗi tầng lý thuyết cung cấp cơ chế nhân quả riêng biệt: Uppsala giải thích đường cong I-P; RBV biện minh cho H2; Foundational Digital Adoption Framework (CDCM) biện minh cho H3; Upper Echelons biện minh cho H4; Institutional Theory biện minh cho H5. Bằng chứng neo đậu từ P3 Việt Nam, P4 Singapore và P5 Trung Quốc xác nhận tính khả nghiệm trước khi áp dụng cho toàn pool 101.185 doanh nghiệp.</w:t>
       </w:r>
     </w:p>
-    <w:bookmarkEnd w:id="48"/>
-    <w:bookmarkStart w:id="52" w:name="hình-2.2-cơ-chế-cdcm-chi-tiết"/>
+    <w:bookmarkEnd w:id="45"/>
+    <w:bookmarkStart w:id="46" w:name="hình-2.2-cơ-chế-cdcm-chi-tiết"/>
     <w:p>
       <w:pPr>
         <w:pStyle w:val="Heading5"/>
@@ -5524,53 +5502,31 @@
         <w:t xml:space="preserve">Hình 2.2, Cơ chế CDCM chi tiết</w:t>
       </w:r>
     </w:p>
-    <w:p>
-      <w:pPr>
-        <w:pStyle w:val="CaptionedFigure"/>
-      </w:pPr>
-      <w:r>
-        <w:drawing>
-          <wp:inline>
-            <wp:extent cx="5753100" cy="2573755"/>
-            <wp:effectExtent b="0" l="0" r="0" t="0"/>
-            <wp:docPr descr="Hình 2.2: Cơ chế CDCM theo ba nhóm ICRV" title="" id="50" name="Picture"/>
-            <a:graphic>
-              <a:graphicData uri="http://schemas.openxmlformats.org/drawingml/2006/picture">
-                <pic:pic>
-                  <pic:nvPicPr>
-                    <pic:cNvPr descr="figures/hinh_2_2_cdcm_detail.png" id="51" name="Picture"/>
-                    <pic:cNvPicPr>
-                      <a:picLocks noChangeArrowheads="1" noChangeAspect="1"/>
-                    </pic:cNvPicPr>
-                  </pic:nvPicPr>
-                  <pic:blipFill>
-                    <a:blip r:embed="rId49"/>
-                    <a:stretch>
-                      <a:fillRect/>
-                    </a:stretch>
-                  </pic:blipFill>
-                  <pic:spPr bwMode="auto">
-                    <a:xfrm>
-                      <a:off x="0" y="0"/>
-                      <a:ext cx="5753100" cy="2573755"/>
-                    </a:xfrm>
-                    <a:prstGeom prst="rect">
-                      <a:avLst/>
-                    </a:prstGeom>
-                    <a:noFill/>
-                    <a:ln w="9525">
-                      <a:noFill/>
-                      <a:headEnd/>
-                      <a:tailEnd/>
-                    </a:ln>
-                  </pic:spPr>
-                </pic:pic>
-              </a:graphicData>
-            </a:graphic>
-          </wp:inline>
-        </w:drawing>
-      </w:r>
-    </w:p>
+    <w:tbl>
+      <w:tblPr>
+        <w:tblStyle w:val="FigureTable"/>
+        <w:tblW w:type="auto" w:w="0"/>
+        <w:tblLook w:firstRow="0" w:lastRow="0" w:firstColumn="0" w:lastColumn="0"/>
+        <w:jc w:val="center"/>
+      </w:tblPr>
+      <w:tblGrid>
+        <w:gridCol w:w="7920"/>
+      </w:tblGrid>
+      <w:tr>
+        <w:tc>
+          <w:tcPr/>
+          <w:p>
+            <w:pPr>
+              <w:pStyle w:val="Compact"/>
+              <w:jc w:val="center"/>
+            </w:pPr>
+            <w:r>
+              <w:t xml:space="preserve">Hình 2.2: Cơ chế CDCM theo ba nhóm ICRV</w:t>
+            </w:r>
+          </w:p>
+        </w:tc>
+      </w:tr>
+    </w:tbl>
     <w:p>
       <w:pPr>
         <w:pStyle w:val="ImageCaption"/>
@@ -5678,8 +5634,8 @@
         <w:t xml:space="preserve">đều nhất quán với lý thuyết CDCM, khác nhau ở điều kiện bối cảnh, không mâu thuẫn về lý thuyết nền tảng.</w:t>
       </w:r>
     </w:p>
-    <w:bookmarkEnd w:id="52"/>
-    <w:bookmarkStart w:id="53" w:name="bảng-2.4-mapping-biến-đầy-đủ"/>
+    <w:bookmarkEnd w:id="46"/>
+    <w:bookmarkStart w:id="47" w:name="bảng-2.4-mapping-biến-đầy-đủ"/>
     <w:p>
       <w:pPr>
         <w:pStyle w:val="Heading5"/>
@@ -7116,9 +7072,9 @@
         <w:t xml:space="preserve">để giảm đa cộng tuyến.</w:t>
       </w:r>
     </w:p>
-    <w:bookmarkEnd w:id="53"/>
-    <w:bookmarkEnd w:id="54"/>
-    <w:bookmarkStart w:id="63" w:name="hệ-giả-thuyết-nghiên-cứu-h1-h6"/>
+    <w:bookmarkEnd w:id="47"/>
+    <w:bookmarkEnd w:id="48"/>
+    <w:bookmarkStart w:id="57" w:name="hệ-giả-thuyết-nghiên-cứu-h1-h6"/>
     <w:p>
       <w:pPr>
         <w:pStyle w:val="Heading4"/>
@@ -7127,7 +7083,7 @@
         <w:t xml:space="preserve">2.3.4 Hệ giả thuyết nghiên cứu (H1-H6)</w:t>
       </w:r>
     </w:p>
-    <w:bookmarkStart w:id="55" w:name="tổng-quan-và-logic-phát-triển-giả-thuyết"/>
+    <w:bookmarkStart w:id="49" w:name="tổng-quan-và-logic-phát-triển-giả-thuyết"/>
     <w:p>
       <w:pPr>
         <w:pStyle w:val="Heading5"/>
@@ -7155,8 +7111,8 @@
         <w:t xml:space="preserve">$2 bằng chứng neo đậu từ P3/P4/P5). H4a-H4b và H6 là hỗn hợp xác nhận/khám phá (hướng rõ nhưng magnitude khám phá). H4c là hoàn toàn khám phá (two-sided, không có dấu tiên nghiệm).</w:t>
       </w:r>
     </w:p>
-    <w:bookmarkEnd w:id="55"/>
-    <w:bookmarkStart w:id="56" w:name="h1-phi-tuyến-trong-quan-hệ-i-p"/>
+    <w:bookmarkEnd w:id="49"/>
+    <w:bookmarkStart w:id="50" w:name="h1-phi-tuyến-trong-quan-hệ-i-p"/>
     <w:p>
       <w:pPr>
         <w:pStyle w:val="Heading5"/>
@@ -7316,8 +7272,8 @@
         <w:t xml:space="preserve">H1b (biên cường độ, gần phẳng): Trong mẫu chỉ gồm doanh nghiệp xuất khẩu, đường cong I-P gần phẳng, tức là sau khi đã xuất khẩu, việc tăng cường độ tiếp theo không tạo thêm nhiều lợi ích năng suất nếu không có TCI và DAI đủ mạnh.</w:t>
       </w:r>
     </w:p>
-    <w:bookmarkEnd w:id="56"/>
-    <w:bookmarkStart w:id="57" w:name="h2-tci-điều-tiết-tích-cực-nâng-mặt-bằng"/>
+    <w:bookmarkEnd w:id="50"/>
+    <w:bookmarkStart w:id="51" w:name="h2-tci-điều-tiết-tích-cực-nâng-mặt-bằng"/>
     <w:p>
       <w:pPr>
         <w:pStyle w:val="Heading5"/>
@@ -7350,8 +7306,8 @@
         <w:t xml:space="preserve">H2: Technological Capability Index (TCI) có mối quan hệ dương trực tiếp với hiệu quả doanh nghiệp (β(TCI) &gt; 0) và nâng mặt bằng ln(LP) của toàn bộ đường cong I-P (hiệu ứng nâng mặt bằng). Tác động điều tiết của TCI lên độ cong của đường cong là câu hỏi thực nghiệm mở và được kiểm định như H2 khám phá trong M3.</w:t>
       </w:r>
     </w:p>
-    <w:bookmarkEnd w:id="57"/>
-    <w:bookmarkStart w:id="58" w:name="Xf726aff41a886fb83bbce40f5451eaeea259ac9"/>
+    <w:bookmarkEnd w:id="51"/>
+    <w:bookmarkStart w:id="52" w:name="Xf726aff41a886fb83bbce40f5451eaeea259ac9"/>
     <w:p>
       <w:pPr>
         <w:pStyle w:val="Heading5"/>
@@ -8051,8 +8007,8 @@
         <w:t xml:space="preserve">β(DAI) và hai cấu trúc thỏa mãn tiêu chí discriminant validity).</w:t>
       </w:r>
     </w:p>
-    <w:bookmarkEnd w:id="58"/>
-    <w:bookmarkStart w:id="59" w:name="h4a-h4c-đặc-điểm-nhà-quản-trị-điều-tiết"/>
+    <w:bookmarkEnd w:id="52"/>
+    <w:bookmarkStart w:id="53" w:name="h4a-h4c-đặc-điểm-nhà-quản-trị-điều-tiết"/>
     <w:p>
       <w:pPr>
         <w:pStyle w:val="Heading5"/>
@@ -8130,8 +8086,8 @@
         <w:t xml:space="preserve">Phạm vi kiểm định: H4a-H4b là biến đại diện (proxy) cho cơ chế Upper Echelons, kết quả là chỉ báo gián tiếp, không phải kiểm định trực tiếp cấu trúc lý thuyết gốc. Hạn chế này cần được thừa nhận rõ trong phần thảo luận kết quả.</w:t>
       </w:r>
     </w:p>
-    <w:bookmarkEnd w:id="59"/>
-    <w:bookmarkStart w:id="60" w:name="h5-thể-chế-icrv-điều-tiết-theo-gradient"/>
+    <w:bookmarkEnd w:id="53"/>
+    <w:bookmarkStart w:id="54" w:name="h5-thể-chế-icrv-điều-tiết-theo-gradient"/>
     <w:p>
       <w:pPr>
         <w:pStyle w:val="Heading5"/>
@@ -8479,8 +8435,8 @@
         <w:t xml:space="preserve">, phản ánh chi phí giao dịch thấp và năng lực điều phối cao trong bối cảnh thể chế vững mạnh.</w:t>
       </w:r>
     </w:p>
-    <w:bookmarkEnd w:id="60"/>
-    <w:bookmarkStart w:id="61" w:name="h6-tính-không-đồng-nhất-theo-thời-gian"/>
+    <w:bookmarkEnd w:id="54"/>
+    <w:bookmarkStart w:id="55" w:name="h6-tính-không-đồng-nhất-theo-thời-gian"/>
     <w:p>
       <w:pPr>
         <w:pStyle w:val="Heading5"/>
@@ -8534,8 +8490,8 @@
         <w:t xml:space="preserve">×Year_bucket) khác nhau có ý nghĩa thống kê giữa ba giai đoạn 2009-2012, 2013-2017, và 2018-2025. Cụ thể: tác động TCI tăng cường theo thời gian; tác động DAI biến thiên theo giai đoạn; điểm uốn có thể dịch chuyển trong một số nhóm ICRV nhưng ổn định trong các nhóm khác.</w:t>
       </w:r>
     </w:p>
-    <w:bookmarkEnd w:id="61"/>
-    <w:bookmarkStart w:id="62" w:name="tổng-hợp-hệ-giả-thuyết"/>
+    <w:bookmarkEnd w:id="55"/>
+    <w:bookmarkStart w:id="56" w:name="tổng-hợp-hệ-giả-thuyết"/>
     <w:p>
       <w:pPr>
         <w:pStyle w:val="Heading5"/>
@@ -9474,9 +9430,9 @@
         <w:t xml:space="preserve">Tích hợp cả sáu giả thuyết trong M7 (điều tiết ba chiều) cho phép kiểm định xem TCI và DAI là bổ sung (β(TCI×DAI×FSTS) &gt; 0) hay thay thế (β &lt; 0) trong điều tiết I-P ở Nhóm I, câu hỏi chưa được trả lời trong bất kỳ nghiên cứu I-P nào trước đây.</w:t>
       </w:r>
     </w:p>
-    <w:bookmarkEnd w:id="62"/>
-    <w:bookmarkEnd w:id="63"/>
-    <w:bookmarkStart w:id="74" w:name="thiết-kế-mô-hình-thực-nghiệm-m0-m7"/>
+    <w:bookmarkEnd w:id="56"/>
+    <w:bookmarkEnd w:id="57"/>
+    <w:bookmarkStart w:id="68" w:name="thiết-kế-mô-hình-thực-nghiệm-m0-m7"/>
     <w:p>
       <w:pPr>
         <w:pStyle w:val="Heading4"/>
@@ -9485,7 +9441,7 @@
         <w:t xml:space="preserve">2.3.5 Thiết kế mô hình thực nghiệm (M0-M7)</w:t>
       </w:r>
     </w:p>
-    <w:bookmarkStart w:id="64" w:name="nguyên-tắc-đặc-tả"/>
+    <w:bookmarkStart w:id="58" w:name="nguyên-tắc-đặc-tả"/>
     <w:p>
       <w:pPr>
         <w:pStyle w:val="Heading5"/>
@@ -9586,8 +9542,8 @@
         <w:t xml:space="preserve">&gt; 0,01 để thêm biến điều tiết; ΔAIC &lt; −2 ủng hộ mô hình phức tạp hơn; ΔBIC &lt; −10 là bằng chứng mạnh; F-test p &lt; 0,05 để thêm khối biến. M7 được báo cáo nếu ΔAIC(M7 vs M4+M3 kết hợp) &lt; −2 VÀ F-test p &lt; 0,05.</w:t>
       </w:r>
     </w:p>
-    <w:bookmarkEnd w:id="64"/>
-    <w:bookmarkStart w:id="65" w:name="m0-baseline-tuyến-tính"/>
+    <w:bookmarkEnd w:id="58"/>
+    <w:bookmarkStart w:id="59" w:name="m0-baseline-tuyến-tính"/>
     <w:p>
       <w:pPr>
         <w:pStyle w:val="Heading5"/>
@@ -9644,8 +9600,8 @@
         <w:t xml:space="preserve">Hạn chế: không nắm bắt được phi tuyến tính, cung cấp ước lượng cận dưới cho tác động quốc tế hóa.</w:t>
       </w:r>
     </w:p>
-    <w:bookmarkEnd w:id="65"/>
-    <w:bookmarkStart w:id="66" w:name="X75646ecbe4363f90b6d09bbb84a86967944c7db"/>
+    <w:bookmarkEnd w:id="59"/>
+    <w:bookmarkStart w:id="60" w:name="X75646ecbe4363f90b6d09bbb84a86967944c7db"/>
     <w:p>
       <w:pPr>
         <w:pStyle w:val="Heading5"/>
@@ -9765,8 +9721,8 @@
         <w:t xml:space="preserve">Kiểm định bổ sung: Lind-Mehlum (2010) để xác nhận chữ U ngược thực sự.</w:t>
       </w:r>
     </w:p>
-    <w:bookmarkEnd w:id="66"/>
-    <w:bookmarkStart w:id="67" w:name="m2-s-curve-bậc-ba-kiểm-định-h1-đầy-đủ"/>
+    <w:bookmarkEnd w:id="60"/>
+    <w:bookmarkStart w:id="61" w:name="m2-s-curve-bậc-ba-kiểm-định-h1-đầy-đủ"/>
     <w:p>
       <w:pPr>
         <w:pStyle w:val="Heading5"/>
@@ -9892,8 +9848,8 @@
         <w:t xml:space="preserve">= 0.</w:t>
       </w:r>
     </w:p>
-    <w:bookmarkEnd w:id="67"/>
-    <w:bookmarkStart w:id="68" w:name="m3-điều-tiết-tci-kiểm-định-h2"/>
+    <w:bookmarkEnd w:id="61"/>
+    <w:bookmarkStart w:id="62" w:name="m3-điều-tiết-tci-kiểm-định-h2"/>
     <w:p>
       <w:pPr>
         <w:pStyle w:val="Heading5"/>
@@ -10050,8 +10006,8 @@
         <w:t xml:space="preserve">= 0) = kiểm định joint moderation; nếu p &gt; 0,10 thì TCI là nâng mặt bằng thuần túy.</w:t>
       </w:r>
     </w:p>
-    <w:bookmarkEnd w:id="68"/>
-    <w:bookmarkStart w:id="69" w:name="m4-điều-tiết-dai-kiểm-định-h3"/>
+    <w:bookmarkEnd w:id="62"/>
+    <w:bookmarkStart w:id="63" w:name="m4-điều-tiết-dai-kiểm-định-h3"/>
     <w:p>
       <w:pPr>
         <w:pStyle w:val="Heading5"/>
@@ -10146,8 +10102,8 @@
         <w:t xml:space="preserve">Lưu ý IV: trong mẫu con Nhóm IV, nếu có biến công cụ hợp lệ, chạy 2SLS để phân biệt DAI nhân quả vs. phụ thuộc chọn lựa.</w:t>
       </w:r>
     </w:p>
-    <w:bookmarkEnd w:id="69"/>
-    <w:bookmarkStart w:id="70" w:name="Xa11d8e594967f6dc9b7fd56ec467a6a3177254d"/>
+    <w:bookmarkEnd w:id="63"/>
+    <w:bookmarkStart w:id="64" w:name="Xa11d8e594967f6dc9b7fd56ec467a6a3177254d"/>
     <w:p>
       <w:pPr>
         <w:pStyle w:val="Heading5"/>
@@ -10281,8 +10237,8 @@
         <w:t xml:space="preserve">(FSTS×gender_manager), không có kỳ vọng tiên nghiệm [H4c].</w:t>
       </w:r>
     </w:p>
-    <w:bookmarkEnd w:id="70"/>
-    <w:bookmarkStart w:id="71" w:name="m6-chế-độ-thể-chế-icrv-kiểm-định-h5"/>
+    <w:bookmarkEnd w:id="64"/>
+    <w:bookmarkStart w:id="65" w:name="m6-chế-độ-thể-chế-icrv-kiểm-định-h5"/>
     <w:p>
       <w:pPr>
         <w:pStyle w:val="Heading5"/>
@@ -10339,8 +10295,8 @@
         <w:t xml:space="preserve">Lưu ý: Country FE bị omit trong M6 do ICRV_j là biến cấp quốc gia bất biến theo thời gian, thay bằng Year FE + Region FE (6 vùng).</w:t>
       </w:r>
     </w:p>
-    <w:bookmarkEnd w:id="71"/>
-    <w:bookmarkStart w:id="72" w:name="Xf830d1be5186ac8af15f5b67785ac8d9f713bf8"/>
+    <w:bookmarkEnd w:id="65"/>
+    <w:bookmarkStart w:id="66" w:name="Xf830d1be5186ac8af15f5b67785ac8d9f713bf8"/>
     <w:p>
       <w:pPr>
         <w:pStyle w:val="Heading5"/>
@@ -10571,8 +10527,8 @@
         <w:t xml:space="preserve">= 0,02, dễ dàng đáp ứng với pool 101.185.</w:t>
       </w:r>
     </w:p>
-    <w:bookmarkEnd w:id="72"/>
-    <w:bookmarkStart w:id="73" w:name="bảng-tổng-hợp-mô-hình"/>
+    <w:bookmarkEnd w:id="66"/>
+    <w:bookmarkStart w:id="67" w:name="bảng-tổng-hợp-mô-hình"/>
     <w:p>
       <w:pPr>
         <w:pStyle w:val="Heading5"/>
@@ -11362,9 +11318,9 @@
         </w:tc>
       </w:tr>
     </w:tbl>
-    <w:bookmarkEnd w:id="73"/>
-    <w:bookmarkEnd w:id="74"/>
-    <w:bookmarkStart w:id="79" w:name="dữ-liệu-và-chiến-lược-nhận-dạng-nhân-quả"/>
+    <w:bookmarkEnd w:id="67"/>
+    <w:bookmarkEnd w:id="68"/>
+    <w:bookmarkStart w:id="73" w:name="dữ-liệu-và-chiến-lược-nhận-dạng-nhân-quả"/>
     <w:p>
       <w:pPr>
         <w:pStyle w:val="Heading4"/>
@@ -11373,7 +11329,7 @@
         <w:t xml:space="preserve">2.3.6 Dữ liệu và chiến lược nhận dạng nhân quả</w:t>
       </w:r>
     </w:p>
-    <w:bookmarkStart w:id="75" w:name="nguồn-dữ-liệu-và-cấu-trúc-pool"/>
+    <w:bookmarkStart w:id="69" w:name="nguồn-dữ-liệu-và-cấu-trúc-pool"/>
     <w:p>
       <w:pPr>
         <w:pStyle w:val="Heading5"/>
@@ -11959,8 +11915,8 @@
         <w:t xml:space="preserve">Giao thức hòa hợp bao gồm: crosswalk biến giữa ba schema; xử lý giá trị thiếu; loại bỏ ngoại lệ tại phân vị 1/99; chuyển đổi doanh thu về PPP USD 2017.</w:t>
       </w:r>
     </w:p>
-    <w:bookmarkEnd w:id="75"/>
-    <w:bookmarkStart w:id="76" w:name="đo-lường-biến-chi-tiết"/>
+    <w:bookmarkEnd w:id="69"/>
+    <w:bookmarkStart w:id="70" w:name="đo-lường-biến-chi-tiết"/>
     <w:p>
       <w:pPr>
         <w:pStyle w:val="Heading5"/>
@@ -12780,8 +12736,8 @@
         <w:t xml:space="preserve">Chiến lược đo lường DAI: sử dụng DAI_z_full làm biến chính trong mẫu con BEE; DAI_z_tier1 cho so sánh xuyên schema và kiểm định độ vững.</w:t>
       </w:r>
     </w:p>
-    <w:bookmarkEnd w:id="76"/>
-    <w:bookmarkStart w:id="77" w:name="phân-loại-icrv-6-nhóm"/>
+    <w:bookmarkEnd w:id="70"/>
+    <w:bookmarkStart w:id="71" w:name="phân-loại-icrv-6-nhóm"/>
     <w:p>
       <w:pPr>
         <w:pStyle w:val="Heading5"/>
@@ -13197,8 +13153,8 @@
         <w:t xml:space="preserve">$3 năm liên tiếp, không có trường hợp nào).</w:t>
       </w:r>
     </w:p>
-    <w:bookmarkEnd w:id="77"/>
-    <w:bookmarkStart w:id="78" w:name="chiến-lược-nhận-dạng-nhân-quả"/>
+    <w:bookmarkEnd w:id="71"/>
+    <w:bookmarkStart w:id="72" w:name="chiến-lược-nhận-dạng-nhân-quả"/>
     <w:p>
       <w:pPr>
         <w:pStyle w:val="Heading5"/>
@@ -13575,9 +13531,9 @@
         <w:t xml:space="preserve">Tầng 4, Nhân rộng mẫu con: Pool đủ lớn (101.185) cho phép chạy M0-M7 riêng cho từng nhóm ICRV (Nhóm I: ~6.500; Nhóm IV: ~28.000) để kiểm định tính không đồng nhất.</w:t>
       </w:r>
     </w:p>
-    <w:bookmarkEnd w:id="78"/>
-    <w:bookmarkEnd w:id="79"/>
-    <w:bookmarkStart w:id="80" w:name="kế-hoạch-kiểm-định-độ-vững"/>
+    <w:bookmarkEnd w:id="72"/>
+    <w:bookmarkEnd w:id="73"/>
+    <w:bookmarkStart w:id="74" w:name="kế-hoạch-kiểm-định-độ-vững"/>
     <w:p>
       <w:pPr>
         <w:pStyle w:val="Heading4"/>
@@ -14100,8 +14056,8 @@
         <w:t xml:space="preserve">. Nếu &lt; 2/6 nhóm nhất quán, kết quả cần tái xem xét và không được tuyên bố giả thuyết được xác nhận.</w:t>
       </w:r>
     </w:p>
-    <w:bookmarkEnd w:id="80"/>
-    <w:bookmarkStart w:id="84" w:name="Xa7a3e024942ac139f282b38617464477c22cff4"/>
+    <w:bookmarkEnd w:id="74"/>
+    <w:bookmarkStart w:id="78" w:name="Xa7a3e024942ac139f282b38617464477c22cff4"/>
     <w:p>
       <w:pPr>
         <w:pStyle w:val="Heading4"/>
@@ -14110,7 +14066,7 @@
         <w:t xml:space="preserve">2.3.8 Thảo luận: đóng góp lý thuyết và thực tiễn</w:t>
       </w:r>
     </w:p>
-    <w:bookmarkStart w:id="81" w:name="đóng-góp-lý-thuyết"/>
+    <w:bookmarkStart w:id="75" w:name="đóng-góp-lý-thuyết"/>
     <w:p>
       <w:pPr>
         <w:pStyle w:val="Heading5"/>
@@ -14151,8 +14107,8 @@
         <w:t xml:space="preserve">Đóng góp 4: Giả thuyết gánh nặng bắt buộc trong khung I-P. Dạng hàm forced penalty (SIDS Nhóm VI) được tích hợp vào H5 như trường hợp cực đoan của gradient thể chế, SIDS không có chữ U ngược điển hình do quốc tế hóa bắt buộc (Briguglio, 1995). Tích hợp này mở rộng dòng nghiên cứu về quan hệ I-P từ châu Á lục địa sang các quốc đảo nhỏ Thái Bình Dương.</w:t>
       </w:r>
     </w:p>
-    <w:bookmarkEnd w:id="81"/>
-    <w:bookmarkStart w:id="82" w:name="đóng-góp-về-mô-hình-và-phương-pháp"/>
+    <w:bookmarkEnd w:id="75"/>
+    <w:bookmarkStart w:id="76" w:name="đóng-góp-về-mô-hình-và-phương-pháp"/>
     <w:p>
       <w:pPr>
         <w:pStyle w:val="Heading5"/>
@@ -14193,8 +14149,8 @@
         <w:t xml:space="preserve">Đóng góp 8: Thiết kế giai đoạn thời gian ba giai đoạn. Phân chia 14 sóng WBES thành ba giai đoạn (2009-12 / 2013-17 / 2018-25) và kiểm định tương tác FSTS×Year_bucket là thiết kế chưa được áp dụng trong các nghiên cứu về quan hệ I-P cho châu Á. Bằng chứng từ P3 Việt Nam và P5 Trung Quốc neo đậu kỳ vọng thực nghiệm.</w:t>
       </w:r>
     </w:p>
-    <w:bookmarkEnd w:id="82"/>
-    <w:bookmarkStart w:id="83" w:name="hàm-ý-chính-sách"/>
+    <w:bookmarkEnd w:id="76"/>
+    <w:bookmarkStart w:id="77" w:name="hàm-ý-chính-sách"/>
     <w:p>
       <w:pPr>
         <w:pStyle w:val="Heading5"/>
@@ -14298,10 +14254,10 @@
         </w:pict>
       </w:r>
     </w:p>
-    <w:bookmarkEnd w:id="83"/>
-    <w:bookmarkEnd w:id="84"/>
-    <w:bookmarkEnd w:id="85"/>
-    <w:bookmarkStart w:id="89" w:name="kết-luận-và-đề-xuất"/>
+    <w:bookmarkEnd w:id="77"/>
+    <w:bookmarkEnd w:id="78"/>
+    <w:bookmarkEnd w:id="79"/>
+    <w:bookmarkStart w:id="83" w:name="kết-luận-và-đề-xuất"/>
     <w:p>
       <w:pPr>
         <w:pStyle w:val="Heading3"/>
@@ -14310,7 +14266,7 @@
         <w:t xml:space="preserve">2.4 Kết luận và đề xuất</w:t>
       </w:r>
     </w:p>
-    <w:bookmarkStart w:id="86" w:name="kết-luận"/>
+    <w:bookmarkStart w:id="80" w:name="kết-luận"/>
     <w:p>
       <w:pPr>
         <w:pStyle w:val="Heading4"/>
@@ -14372,8 +14328,8 @@
         <w:t xml:space="preserve">Thông điệp chính sách cốt lõi: không có một công thức duy nhất cho quốc tế hóa thành công, chế độ thể chế, năng lực công nghệ nội tại, và mức độ số hóa cùng quyết định hiệu quả của chiến lược xuất khẩu. Chính sách và chiến lược doanh nghiệp cần được hiệu chỉnh theo vị trí trên bản đồ ICRV.</w:t>
       </w:r>
     </w:p>
-    <w:bookmarkEnd w:id="86"/>
-    <w:bookmarkStart w:id="87" w:name="hạn-chế-nghiên-cứu"/>
+    <w:bookmarkEnd w:id="80"/>
+    <w:bookmarkStart w:id="81" w:name="hạn-chế-nghiên-cứu"/>
     <w:p>
       <w:pPr>
         <w:pStyle w:val="Heading4"/>
@@ -14545,8 +14501,8 @@
         </w:pict>
       </w:r>
     </w:p>
-    <w:bookmarkEnd w:id="87"/>
-    <w:bookmarkStart w:id="88" w:name="hướng-nghiên-cứu-tiếp-theo"/>
+    <w:bookmarkEnd w:id="81"/>
+    <w:bookmarkStart w:id="82" w:name="hướng-nghiên-cứu-tiếp-theo"/>
     <w:p>
       <w:pPr>
         <w:pStyle w:val="Heading4"/>
@@ -14746,10 +14702,10 @@
         </w:pict>
       </w:r>
     </w:p>
-    <w:bookmarkEnd w:id="88"/>
-    <w:bookmarkEnd w:id="89"/>
-    <w:bookmarkEnd w:id="90"/>
-    <w:bookmarkStart w:id="91" w:name="tài-liệu-tham-khảo"/>
+    <w:bookmarkEnd w:id="82"/>
+    <w:bookmarkEnd w:id="83"/>
+    <w:bookmarkEnd w:id="84"/>
+    <w:bookmarkStart w:id="85" w:name="tài-liệu-tham-khảo"/>
     <w:p>
       <w:pPr>
         <w:pStyle w:val="Heading2"/>
@@ -16082,8 +16038,8 @@
         </w:pict>
       </w:r>
     </w:p>
-    <w:bookmarkEnd w:id="91"/>
-    <w:bookmarkStart w:id="96" w:name="phụ-lục"/>
+    <w:bookmarkEnd w:id="85"/>
+    <w:bookmarkStart w:id="90" w:name="phụ-lục"/>
     <w:p>
       <w:pPr>
         <w:pStyle w:val="Heading2"/>
@@ -16092,7 +16048,7 @@
         <w:t xml:space="preserve">PHỤ LỤC</w:t>
       </w:r>
     </w:p>
-    <w:bookmarkStart w:id="92" w:name="X4f7d30b1bba41a8911338bb6cb3079208caeb7a"/>
+    <w:bookmarkStart w:id="86" w:name="X4f7d30b1bba41a8911338bb6cb3079208caeb7a"/>
     <w:p>
       <w:pPr>
         <w:pStyle w:val="Heading3"/>
@@ -16203,8 +16159,8 @@
         <w:t xml:space="preserve">Tổng: 5 + 5 + 6 + 7 + 17 + 7 = 47 nền kinh tế.</w:t>
       </w:r>
     </w:p>
-    <w:bookmarkEnd w:id="92"/>
-    <w:bookmarkStart w:id="93" w:name="phụ-lục-b-tóm-tắt-ba-bản-thảo-đồng-hành"/>
+    <w:bookmarkEnd w:id="86"/>
+    <w:bookmarkStart w:id="87" w:name="phụ-lục-b-tóm-tắt-ba-bản-thảo-đồng-hành"/>
     <w:p>
       <w:pPr>
         <w:pStyle w:val="Heading3"/>
@@ -16288,8 +16244,8 @@
         <w:t xml:space="preserve">p = 0,545 (không có sự khác biệt đáng kể); TCI tăng cường theo thời gian (+0,260 lên +0,426, Paternoster p = 0,011).</w:t>
       </w:r>
     </w:p>
-    <w:bookmarkEnd w:id="93"/>
-    <w:bookmarkStart w:id="94" w:name="phụ-lục-c-quy-ước-báo-cáo-thống-kê"/>
+    <w:bookmarkEnd w:id="87"/>
+    <w:bookmarkStart w:id="88" w:name="phụ-lục-c-quy-ước-báo-cáo-thống-kê"/>
     <w:p>
       <w:pPr>
         <w:pStyle w:val="Heading3"/>
@@ -16371,8 +16327,8 @@
         <w:t xml:space="preserve">Kiểm định Paternoster: báo cáo z-statistic và p-value hai chiều cho so sánh hệ số giữa hai nhóm hoặc hai giai đoạn.</w:t>
       </w:r>
     </w:p>
-    <w:bookmarkEnd w:id="94"/>
-    <w:bookmarkStart w:id="95" w:name="Xa84ffce5c253a184851e54c82ab1310212e4bc3"/>
+    <w:bookmarkEnd w:id="88"/>
+    <w:bookmarkStart w:id="89" w:name="Xa84ffce5c253a184851e54c82ab1310212e4bc3"/>
     <w:p>
       <w:pPr>
         <w:pStyle w:val="Heading3"/>
@@ -17352,9 +17308,9 @@
         <w:t xml:space="preserve">(2), 317-372.</w:t>
       </w:r>
     </w:p>
-    <w:bookmarkEnd w:id="95"/>
-    <w:bookmarkEnd w:id="96"/>
-    <w:bookmarkEnd w:id="97"/>
+    <w:bookmarkEnd w:id="89"/>
+    <w:bookmarkEnd w:id="90"/>
+    <w:bookmarkEnd w:id="91"/>
     <w:sectPr>
       <w:pgSz w:h="16838" w:w="11906"/>
       <w:pgMar w:bottom="1134" w:left="1701" w:right="1134" w:top="1134"/>

</xml_diff>